<commit_message>
docs: agrega historial de cambios al documento de documentacion
</commit_message>
<xml_diff>
--- a/Documentacion_ElicitApp.docx
+++ b/Documentacion_ElicitApp.docx
@@ -4072,6 +4072,178 @@
       <w:proofErr w:type="spellEnd"/>
       <w:r>
         <w:t xml:space="preserve"> con fines educativos y de portafolio profesional.</w:t>
+      </w:r>
+    </w:p>
+    <w:p>
+      <w:r>
+        <w:br w:type="page"/>
+      </w:r>
+    </w:p>
+    <w:p>
+      <w:pPr>
+        <w:pStyle w:val="Ttulo1"/>
+      </w:pPr>
+      <w:r>
+        <w:t>14. Historial de Cambios</w:t>
+      </w:r>
+    </w:p>
+    <w:p>
+      <w:r>
+        <w:rPr>
+          <w:b/>
+          <w:sz w:val="22"/>
+        </w:rPr>
+        <w:t>14.1 Blindaaje de System Prompts contra Prompt Injection</w:t>
+      </w:r>
+    </w:p>
+    <w:p>
+      <w:pPr>
+        <w:pStyle w:val="Listaconvietas"/>
+      </w:pPr>
+      <w:r>
+        <w:rPr>
+          <w:sz w:val="20"/>
+        </w:rPr>
+        <w:t>Commit: 5dc665e - security: blindaaje de System Prompts contra prompt injection en stakeholders</w:t>
+      </w:r>
+    </w:p>
+    <w:p>
+      <w:pPr>
+        <w:pStyle w:val="Listaconvietas"/>
+      </w:pPr>
+      <w:r>
+        <w:rPr>
+          <w:sz w:val="20"/>
+        </w:rPr>
+        <w:t>Fecha: 08 de junio de 2026</w:t>
+      </w:r>
+    </w:p>
+    <w:p>
+      <w:pPr>
+        <w:pStyle w:val="Listaconvietas"/>
+      </w:pPr>
+      <w:r>
+        <w:rPr>
+          <w:sz w:val="20"/>
+        </w:rPr>
+        <w:t>Se inserto la DIRECTIVA DE SEGURIDAD ABSOLUTA al inicio de cada System Prompt (sponsor, cliente, usuario).</w:t>
+      </w:r>
+    </w:p>
+    <w:p>
+      <w:pPr>
+        <w:pStyle w:val="Listaconvietas"/>
+      </w:pPr>
+      <w:r>
+        <w:rPr>
+          <w:sz w:val="20"/>
+        </w:rPr>
+        <w:t>Se contextualizo el rechazo por rol: Sponsor defiende presupuesto/ROI, Cliente exige soluciones practicas, Usuario exige usabilidad.</w:t>
+      </w:r>
+    </w:p>
+    <w:p>
+      <w:pPr>
+        <w:pStyle w:val="Listaconvietas"/>
+      </w:pPr>
+      <w:r>
+        <w:rPr>
+          <w:sz w:val="20"/>
+        </w:rPr>
+        <w:t>La directiva referencia dinamicamente el caso de estudio activo y el cargo del stakeholder.</w:t>
+      </w:r>
+    </w:p>
+    <w:p>
+      <w:r>
+        <w:rPr>
+          <w:b/>
+          <w:sz w:val="22"/>
+        </w:rPr>
+        <w:t>14.2 Eliminacion de mensajes de retroalimentacion en chat</w:t>
+      </w:r>
+    </w:p>
+    <w:p>
+      <w:pPr>
+        <w:pStyle w:val="Listaconvietas"/>
+      </w:pPr>
+      <w:r>
+        <w:rPr>
+          <w:sz w:val="20"/>
+        </w:rPr>
+        <w:t>Commit: b09d0a2 - fix: corrige conteo de roles cubiertos y elimina feedback de mensajes</w:t>
+      </w:r>
+    </w:p>
+    <w:p>
+      <w:pPr>
+        <w:pStyle w:val="Listaconvietas"/>
+      </w:pPr>
+      <w:r>
+        <w:rPr>
+          <w:sz w:val="20"/>
+        </w:rPr>
+        <w:t>Fecha: 08 de junio de 2026</w:t>
+      </w:r>
+    </w:p>
+    <w:p>
+      <w:pPr>
+        <w:pStyle w:val="Listaconvietas"/>
+      </w:pPr>
+      <w:r>
+        <w:rPr>
+          <w:sz w:val="20"/>
+        </w:rPr>
+        <w:t>Se eliminaron los mensajes de retroalimentacion (Buena tecnica, Respuesta evasiva, Pregunta cerrada) del componente MensajeChat.</w:t>
+      </w:r>
+    </w:p>
+    <w:p>
+      <w:r>
+        <w:rPr>
+          <w:b/>
+          <w:sz w:val="22"/>
+        </w:rPr>
+        <w:t>14.3 Correccion en conteo de roles cubiertos en evaluacion</w:t>
+      </w:r>
+    </w:p>
+    <w:p>
+      <w:pPr>
+        <w:pStyle w:val="Listaconvietas"/>
+      </w:pPr>
+      <w:r>
+        <w:rPr>
+          <w:sz w:val="20"/>
+        </w:rPr>
+        <w:t>Commit: b09d0a2 (incluido)</w:t>
+      </w:r>
+    </w:p>
+    <w:p>
+      <w:pPr>
+        <w:pStyle w:val="Listaconvietas"/>
+      </w:pPr>
+      <w:r>
+        <w:rPr>
+          <w:sz w:val="20"/>
+        </w:rPr>
+        <w:t>Se corrigio el filtro de rolesUsados para ignorar mensajes del sistema (rol: sistema) que inflaban el contador.</w:t>
+      </w:r>
+    </w:p>
+    <w:p>
+      <w:pPr>
+        <w:pStyle w:val="Listaconvietas"/>
+      </w:pPr>
+      <w:r>
+        <w:rPr>
+          <w:sz w:val="20"/>
+        </w:rPr>
+        <w:t>Se uso Object.keys(caso.roles) como lista blanca de roles validos.</w:t>
+      </w:r>
+    </w:p>
+    <w:p>
+      <w:pPr>
+        <w:pStyle w:val="Listaconvietas"/>
+      </w:pPr>
+      <w:r>
+        <w:rPr>
+          <w:sz w:val="20"/>
+        </w:rPr>
+        <w:t>Se actualizo la pantalla de evaluacion para mostrar el total de roles de forma dinamica.</w:t>
       </w:r>
     </w:p>
     <w:sectPr>

</xml_diff>